<commit_message>
Rewrite report in natural first-person voice; remove template phrasing
</commit_message>
<xml_diff>
--- a/reports/DA2_Project_Report.docx
+++ b/reports/DA2_Project_Report.docx
@@ -119,7 +119,7 @@
                 <w:sz w:val="26"/>
                 <w:szCs w:val="26"/>
               </w:rPr>
-              <w:t xml:space="preserve">Project Report — Design Assignment 2</w:t>
+              <w:t xml:space="preserve">Project Report (Design Assignment 2)</w:t>
             </w:r>
           </w:p>
           <w:p>
@@ -880,7 +880,7 @@
           <w:sz w:val="24"/>
           <w:szCs w:val="24"/>
         </w:rPr>
-        <w:t xml:space="preserve">Search and rescue (SAR) operations in disaster-hit environments demand rapid, thorough coverage of large and hazardous areas — conditions under which a single robot is fundamentally limited. This report presents the design, implementation, and evaluation of a cognitive multi-robot SAR system in which a team of three simulated robots collaboratively maps a collapsed-structure environment, detects and shares victim discoveries through a common semantic memory, and divides the search workload through a learned task-allocation policy. The system was developed on ROS 2 (Jazzy) with the Gazebo Harmonic simulator. Each robot performs lidar-based SLAM; per-robot maps are fused into a single global grid; a camera-based detector projects victim sightings into the map frame; and a shared semantic-map node makes every discovery available to the whole team. Two interchangeable task allocators were built: a greedy nearest-frontier baseline and a multi-agent reinforcement learning policy (MAPPO, centralized training with decentralized execution) trained on a lightweight grid abstraction of the world, with rewards for exploration and victim discovery and penalties for redundant coverage and elapsed time. On held-out test maps, the learned policy matched the hand-crafted baseline in map coverage (85% vs 86%) and detected victims faster on average (43 vs 49 steps), while finding fewer victims per mission (3.25 vs 4.25 of 5) at the evaluated training budget of approximately 148,000 steps. The results establish a complete, tested, and reproducible system in which the remaining performance gap is attributable to training budget rather than design, and define a clear path — longer training, simulator-level benchmarking, and semantic ablation — toward the final deliverable.</w:t>
+        <w:t xml:space="preserve">Robots are increasingly used to look for survivors after earthquakes and building collapses, but almost always one robot at a time. That is slow. The search area after a disaster is large, the window in which survivors can be saved is short, and a single robot covering one corridor at a time wastes most of it. Simply adding more robots does not fix things either, because without proper coordination the robots crowd into the same half-explored rooms and re-search each other's ground. This report presents a three-robot search and rescue system that we designed, built and tested completely in simulation on ROS 2 Jazzy with the Gazebo Harmonic simulator. Each robot maps its surroundings with lidar SLAM, the individual maps are fused into one global map, and a camera based detector reports the map position of any victim it sees. All of these findings land in a shared semantic map that every robot can read, so nothing gets located twice. To decide who searches where, we built two allocators behind the same interface: a plain greedy nearest-frontier rule, and a task allocation policy learned with multi-agent reinforcement learning (MAPPO, centralized training with decentralized execution). The learned policy trains in minutes on a CPU in a simplified grid version of the world. On held-out test maps it matched the greedy rule on map coverage (85% against 86%) and found its first victims faster (43 steps against 49), though at the training budget we managed (~148k steps) it still trails the rule on total victims per mission (3.25 against 4.25 of 5). We believe the gap comes from training time rather than the design, and the next steps (a longer GPU run, benchmarks inside Gazebo itself, and an ablation without the semantic map) are already set up.</w:t>
       </w:r>
     </w:p>
     <w:p>
@@ -1432,7 +1432,7 @@
           <w:sz w:val="24"/>
           <w:szCs w:val="24"/>
         </w:rPr>
-        <w:t xml:space="preserve">Urban search and rescue remains one of the most demanding applications of robotics. After earthquakes, building collapses, or industrial accidents, response teams face structurally unstable spaces, limited visibility, and severe time pressure: the probability of finding survivors falls sharply with every passing hour. Ground robots are a natural aid in this setting because they can enter spaces that are unsafe for humans, but deploying only a single robot introduces a fundamental bottleneck — one platform can cover only so much of a large, cluttered environment before the mission window closes.</w:t>
+        <w:t xml:space="preserve">After an earthquake or a building collapse, the first couple of days decide almost everything. Rescue teams have to search a large, unstable, poorly lit area, and every hour spent walking down a corridor that has already been checked is an hour not spent somewhere else. Ground robots can help here because they can go where it is unsafe for humans, but in practice they are still mostly used one at a time. One robot maps one corridor at a time, and the maths simply does not work for a large site.</w:t>
       </w:r>
     </w:p>
     <w:p>
@@ -1447,7 +1447,7 @@
           <w:sz w:val="24"/>
           <w:szCs w:val="24"/>
         </w:rPr>
-        <w:t xml:space="preserve">Introducing multiple robots multiplies coverage capacity, but it also introduces a coordination problem that grows with team size. Without deliberate coordination, robots cluster in the same partially explored areas, repeatedly re-observe the same space, and waste the very time budget the team was meant to save. Moreover, the raw occupancy maps that typical multi-robot systems merge answer only the question “what does the world look like” — not the question that actually matters for search: “where should each robot go next, given what has already been found?”</w:t>
+        <w:t xml:space="preserve">The obvious answer is to use several robots at once. The catch is that several robots, each naively exploring on its own, tend to behave like several people searching a building without talking to each other: they drift toward the same open areas, cover the same ground twice, and leave whole wings unchecked. We saw exactly this behaviour in early tests of our own simulator before any coordination was added. So the real problem is not mapping, and it is not driving; it is deciding, continuously and collectively, which parts of the building still need attention.</w:t>
       </w:r>
     </w:p>
     <w:p>
@@ -1462,7 +1462,7 @@
           <w:sz w:val="24"/>
           <w:szCs w:val="24"/>
         </w:rPr>
-        <w:t xml:space="preserve">This project addresses that gap. Following our DA1 proposal, we built a multi-robot SAR system in which robots (a) jointly construct a global map, (b) enrich it with semantic information — located victims — held in a shared memory accessible to every robot, and (c) use that shared state to divide the search through a task-allocation policy that is learned rather than hand-coded. The concrete objectives, carried over from the DA1 abstract, are: (O1) collaborative SLAM-based mapping across robots; (O2) semantic scene understanding with victim detection; (O3) a shared memory layer queryable by all robots; (O4) a multi-agent reinforcement learning (MARL) policy for task allocation, trained as MAPPO under centralized training with decentralized execution (CTDE); and (O5) a benchmark of the learned policy against a rule-based allocation baseline.</w:t>
+        <w:t xml:space="preserve">That is the problem this project takes on. Following our DA1 proposal, we built a multi-robot search and rescue system in simulation with five concrete goals: (O1) the robots should build one shared map from their individual SLAM maps; (O2) they should recognize victims with a camera and work out where those victims are on the map; (O3) all of these discoveries should live in a shared memory that every robot can query; (O4) the choice of which region each robot searches next should be made by a policy that is learned with multi-agent reinforcement learning rather than written by hand; and (O5) that learned policy should be benchmarked against a hand-written rule to find out whether the learning actually pays.</w:t>
       </w:r>
     </w:p>
     <w:p>
@@ -1477,7 +1477,7 @@
           <w:sz w:val="24"/>
           <w:szCs w:val="24"/>
         </w:rPr>
-        <w:t xml:space="preserve">The contributions of this phase of work are: a complete, modular ROS 2 implementation of the proposed architecture in eleven packages; a procedural world generator that guarantees the simulation environment matches the training environment; a custom multi-robot map-fusion node; a shared semantic-memory service with deduplication and stable identification; two interchangeable allocators with identical interfaces; a training stack (environment, MAPPO implementation, evaluation scripts) that trains on CPU in minutes; a contract test suite that pins the observation interface between training and deployment; and an initial benchmark with results reported in Section 4. The remainder of the report is organized as follows: Section 2 reviews related work; Section 3 details the proposed system; Section 4 reports results and analysis; Section 5 concludes with future work.</w:t>
+        <w:t xml:space="preserve">What has come out of this phase so far: eleven ROS 2 packages and a standalone training stack, all in one repository; a world generator that keeps the simulator and the training environment consistent by construction; our own map fusion node after the available package turned out not to fit our setup; a shared semantic memory with deduplication; two interchangeable allocators; a contract test suite that stops the trained policy and the deployed one from drifting apart; and a first round of benchmark results, reported in Section 4. The report is arranged as follows: Section 2 covers earlier work, Section 3 explains what we built and why, Section 4 gives results and an honest analysis of them, and Section 5 concludes.</w:t>
       </w:r>
     </w:p>
     <w:p>
@@ -1531,7 +1531,7 @@
           <w:sz w:val="24"/>
           <w:szCs w:val="24"/>
         </w:rPr>
-        <w:t xml:space="preserve">Robot-assisted USAR has been studied for over two decades. Casper and Murphy [1] documented human–robot interaction during the robot-assisted response at the World Trade Center site and identified the core demands that still shape the field: rapid wide-area search, victim identification, and operation in confined, debris-strewn spaces. Their analysis makes explicit why multi-robot coverage matters — victim survival probability decays with time — and motivates the time-based metrics (time-to-detection, mission duration) adopted in this project.</w:t>
+        <w:t xml:space="preserve">Robot assisted rescue has a longer history than most people assume. Casper and Murphy studied the robots that were actually sent into the World Trade Center rubble in 2001 and wrote up what worked and what did not [1]. Their conclusions shaped our metric choices more than anything else we read: what matters in a rescue is not elegance but time, so we measure time-to-detection and total mission time, not just coverage percentages.</w:t>
       </w:r>
     </w:p>
     <w:p>
@@ -1565,7 +1565,7 @@
           <w:sz w:val="24"/>
           <w:szCs w:val="24"/>
         </w:rPr>
-        <w:t xml:space="preserve">Frontier-based exploration, introduced by Yamauchi [2], remains the dominant strategy for autonomous exploration: robots navigate to the boundaries between known free space and unknown space. Our rule-based allocator is a region-partitioned variant of this classic approach, and our learned allocator explicitly takes frontier information as input. The underlying mapping formulation follows the occupancy-grid and probabilistic-SLAM treatment of Thrun, Burgard, and Fox [3]; in implementation we use the open-source slam_toolbox stack on ROS 2 per robot, with a custom fusion node that stitches per-robot grids using known initial poses.</w:t>
+        <w:t xml:space="preserve">For the exploration itself, the idea that still underpins nearly everything is Yamauchi's frontier based approach from 1997 [2]: keep driving toward the boundary between what the robot has seen and what it has not. Both of our allocators, learned and hand-written, work on top of frontier information extracted from the merged map. For the mapping we followed the occupancy grid and SLAM treatment in Thrun, Burgard and Fox's book [3], using the open source slam_toolbox package on each robot and fusing the resulting grids ourselves (Section 3.3 explains why we did not use the existing multi-robot merge package).</w:t>
       </w:r>
     </w:p>
     <w:p>
@@ -1599,7 +1599,7 @@
           <w:sz w:val="24"/>
           <w:szCs w:val="24"/>
         </w:rPr>
-        <w:t xml:space="preserve">Cooperative MARL has converged on the CTDE paradigm: during training, a centralized component observes global state, while at execution each agent acts from local observations. MADDPG [4] established the pattern for continuous control; QMIX [5] factorizes a joint value function under monotonicity constraints; and COMA [6] introduces counterfactual baselines for credit assignment. Yu et al. [7] showed that a multi-agent variant of Proximal Policy Optimization — MAPPO, with a centralized value function and shared actor — matches or exceeds these specialized methods on standard benchmarks while being substantially simpler. We adopt MAPPO on that basis, with hyperparameters following the original paper. The underlying single-agent objective is PPO [8].</w:t>
+        <w:t xml:space="preserve">The standard recipe for cooperative multi-agent learning these days is centralized training with decentralized execution: let a critic see everything while the policy is being learned, but let each agent act on only its own view once deployed. MADDPG established the pattern for continuous actions [4], QMIX factors the joint value function under a monotonicity constraint [5], and COMA attacks the credit assignment problem with counterfactual baselines [6]. Then Yu et al. showed something almost embarrassing: plain PPO, run on each agent with a centralized value critic, matches or beats these purpose-built methods on most cooperative benchmarks [7]. We took them at their word and built our allocator as MAPPO, with hyperparameters from their paper, on top of the standard PPO objective [8].</w:t>
       </w:r>
     </w:p>
     <w:p>
@@ -1633,7 +1633,7 @@
           <w:sz w:val="24"/>
           <w:szCs w:val="24"/>
         </w:rPr>
-        <w:t xml:space="preserve">The system is built on ROS 2 Jazzy [9], chosen for its long-term-support status and multi-robot naming conventions, with the Gazebo Harmonic simulator [10] providing physics and sensor simulation. Victim detection follows the object-detection line initiated by YOLO [11], with the Ultralytics implementation [12]; because the simulation renders victims with a distinctive visual signature, a tuned HSV-blob detector is also provided as a dependency-free fallback. Navigation uses the Nav2 stack [13] with the Smac 2D A* planner, matching the A*-based navigation stated in the DA1 abstract.</w:t>
+        <w:t xml:space="preserve">Everything runs on ROS 2 Jazzy [9], which we picked mainly for its long support window and its clean handling of multiple robots in one namespace, and Gazebo Harmonic [10] for physics and sensors. Victim detection follows the YOLO line of work [11]; we use the Ultralytics implementation [12] when weights are available, with a tuned HSV blob detector as a fallback because our simulated victims have a very strong colour signature. Navigation is Nav2 [13] with the Smac 2D planner, which is an A* planner and therefore matches what we wrote in the DA1 abstract.</w:t>
       </w:r>
     </w:p>
     <w:p>
@@ -1687,7 +1687,7 @@
           <w:sz w:val="24"/>
           <w:szCs w:val="24"/>
         </w:rPr>
-        <w:t xml:space="preserve">Figure 1 shows the overall architecture. It is organized in three tiers. The per-robot tier is replicated for each of the three robots and contains everything that must be namespaced per platform: SLAM, perception, and navigation. The shared-state tier holds the globally consistent world model — the fused occupancy grid, the frontier/region decomposition, and the semantic map of located victims — each exposed as a ROS 2 topic or service that any robot can consume. The decision tier contains the two interchangeable task allocators and the evaluation harness. All interfaces are defined in a frozen contract document; the allocators publish identical goal messages, which is precisely what enables the controlled comparison in Section 4.</w:t>
+        <w:t xml:space="preserve">Figure 1 shows how the system fits together. There are three layers. Everything that must exist once per robot (SLAM, camera detection, navigation) lives in a namespaced copy on each of the three robots. Everything that should exist once for the team (the fused map, the region decomposition, the semantic memory of found victims) sits in the middle, published on topics any robot can read. The decision layer holds the two allocators and the evaluation node. The important design decision is at the bottom of the diagram: both allocators publish exactly the same goal message type on the same topics. Swapping one brain for the other is a launch option, nothing more, and that is what makes the comparison in Section 4 fair.</w:t>
       </w:r>
     </w:p>
     <w:p>
@@ -1748,7 +1748,7 @@
           <w:sz w:val="21"/>
           <w:szCs w:val="21"/>
         </w:rPr>
-        <w:t xml:space="preserve">Figure 1: System architecture — per-robot tier (x3), shared state, and decision/evaluation tier, with the ROS 2 topics that connect them.</w:t>
+        <w:t xml:space="preserve">Figure 1: System architecture. Each block is an implemented ROS 2 node; arrows are actual topics.</w:t>
       </w:r>
     </w:p>
     <w:p>
@@ -1782,7 +1782,7 @@
           <w:sz w:val="24"/>
           <w:szCs w:val="24"/>
         </w:rPr>
-        <w:t xml:space="preserve">The mission world is a 32 m × 32 m indoor collapsed-structure layout: room-and-corridor walls, five victim models with a bright visual signature for detection, and hazard props. Crucially, the world is not hand-authored: a generator script uses the same procedural maze code as the training environment, placing walls, robot spawn points, and victims from a single seed, and emits both the Gazebo world file and a ground-truth file listing exact victim positions. This guarantees that what the policy trains on and what it is deployed against are the same distribution, and provides the ground truth against which detection accuracy and coverage are scored.</w:t>
+        <w:t xml:space="preserve">The test world is a 32 m by 32 m indoor maze with rooms, corridors, five victim figures and some hazard props. We did not draw it by hand. A generator script produces the floor plan procedurally, places the robots in separated corners and the victims well away from the spawns, and writes out both the Gazebo world file and a ground-truth file with the exact victim coordinates. Because the training environment is generated from the very same code, what the policy practises on and what it gets deployed against cannot silently diverge. This part took a few attempts to get right, incidentally: our first generated world did not even load, because Gazebo 8 refuses visual elements without a name attribute, which is the kind of strictness you only discover by running it.</w:t>
       </w:r>
     </w:p>
     <w:p>
@@ -1816,7 +1816,7 @@
           <w:sz w:val="24"/>
           <w:szCs w:val="24"/>
         </w:rPr>
-        <w:t xml:space="preserve">Each robot runs slam_toolbox in its own namespace, producing a local occupancy grid and the odom→base transform. Because the robots’ start poses are known and fixed by the launcher, the local grids are consistent up to a known rigid transform; a custom fusion node exploits this to stitch the per-robot grids into a single global map. The fusion rule per cell is: unknown if no robot observes it, occupied dominates free, otherwise the known value. This design was chosen deliberately: the multi-robot map-merge package available for ROS 2 relies on pose-graph assumptions that did not fit our fixed-start setup, and the custom node is unit-tested against rotation, translation-offset, and unknown-preservation cases.</w:t>
+        <w:t xml:space="preserve">Each robot runs slam_toolbox in its own namespace and produces its own occupancy grid. Joining three grids into one is the job of the merge node. There is an existing package for this (multirobot_map_merge), but it makes assumptions about pose graphs that did not match our setup, where the robots' start poses are known and fixed by the launcher. So we wrote a small fusion node of our own: since the start poses are known, each local grid is consistent up to one rigid transform, and the merge becomes a coordinate transformation plus a per-cell rule (unknown if nobody has seen it, occupied beats free otherwise). It is unit tested against translation offsets, rotation, and unknown-preservation, which caught two real bugs during development.</w:t>
       </w:r>
     </w:p>
     <w:p>
@@ -1850,7 +1850,7 @@
           <w:sz w:val="24"/>
           <w:szCs w:val="24"/>
         </w:rPr>
-        <w:t xml:space="preserve">Each robot carries an RGB camera and a 360° lidar. The detector node identifies victims in image space — via YOLO when weights are available, or a tuned HSV blob detector otherwise — then converts pixel detections into map-frame positions by combining the pinhole bearing model with the nearest valid lidar return along that bearing, and the robot’s map-frame pose from TF. Detections are published as semantic entries and consumed by the shared memory node, which deduplicates sightings of the same victim within a 1 m radius, preserves the first detection time (the time-to-detection metric), assigns stable identifiers, and republishes the complete semantic map at a fixed rate. Every robot — and both allocators — therefore always knows what the team has found, without re-detection.</w:t>
+        <w:t xml:space="preserve">Each robot carries an RGB camera and a 360 degree lidar. When the detector sees something victim-shaped in an image, it needs to answer a second question: where is that thing on the map? We combine the pinhole camera model (which gives a bearing) with the nearest valid lidar return along that bearing (which gives a range), then transform into the map frame using the robot's pose. Detections are published as semantic entries and flow into the shared memory node, which does three small but important jobs: it merges repeat sightings of the same victim within a one metre radius, it remembers the time of the first sighting (this is our time-to-detection metric), and it assigns every victim a stable ID. After that, every robot and both allocators simply know what the team has found.</w:t>
       </w:r>
     </w:p>
     <w:p>
@@ -1884,7 +1884,7 @@
           <w:sz w:val="24"/>
           <w:szCs w:val="24"/>
         </w:rPr>
-        <w:t xml:space="preserve">The global map is partitioned into a 4 × 4 grid of sixteen regions; a region is actionable when it contains frontier cells. The rule-based allocator implements greedy nearest-frontier: each idle robot claims the nearest actionable region not already claimed. It is deterministic, requires no training, and represents the strong classical baseline for coverage-oriented exploration.</w:t>
+        <w:t xml:space="preserve">The global map is cut into a 4 by 4 grid of sixteen regions, and a region counts as actionable while it still contains frontier cells. The baseline allocator is deliberately simple: each idle robot takes the nearest actionable region nobody has claimed. It is deterministic, needed no training, and turns out to be annoyingly hard to beat, which Section 4 discusses.</w:t>
       </w:r>
     </w:p>
     <w:p>
@@ -1899,22 +1899,7 @@
           <w:sz w:val="24"/>
           <w:szCs w:val="24"/>
         </w:rPr>
-        <w:t xml:space="preserve">The learned allocator is a MAPPO policy trained in a lightweight grid abstraction of the same world. Each robot’s observation is a 13 × 13 crop of a 64 × 64 grid (channels: walls, explored, frontier) centred on the robot, plus four scalars (position, victims found so far, elapsed fraction); the centralized critic observes the full grid with all robot positions. Actions select one of the sixteen regions; a built-in A* executor advances the robot one cell per step. The reward combines exploration gain (+0.10 per newly observed cell), victim discovery (+10 each), and penalties for redundant coverage (−0.02 per cell another robot observed first), elapsed time (−0.01 per step), and selecting an exhausted region (−0.05). Training uses PPO’s clipped surrogate with GAE (λ = 0.95), a shared actor across the homogeneous robots, and a centralized critic, following the hyperparameters of Yu et al. [7]. On deployment, the trained network is loaded by a ROS 2 node that rebuilds the identical observation from live topics and publishes each robot’s region goal.</w:t>
-      </w:r>
-    </w:p>
-    <w:p>
-      <w:pPr>
-        <w:spacing w:after="120" w:line="312"/>
-        <w:jc w:val="both"/>
-      </w:pPr>
-      <w:r>
-        <w:rPr>
-          <w:rFonts w:ascii="Times New Roman" w:eastAsia="SimSun"/>
-          <w:color w:val="000000"/>
-          <w:sz w:val="24"/>
-          <w:szCs w:val="24"/>
-        </w:rPr>
-        <w:t xml:space="preserve">Two engineering safeguards connect training to deployment. First, the observation builder on the ROS side is a mirror implementation of the training-side builder, and a contract test verifies numerical equality of crops and a state-dict round-trip with identical network outputs. Second, because the action space is region-level rather than continuous control, training does not require real-time simulation, which is what makes CPU-side training practical.</w:t>
+        <w:t xml:space="preserve">The learned allocator is a MAPPO policy trained on a grid abstraction of the same world. Each robot's observation is a 13 by 13 cell crop (walls, explored space, frontiers) centred on its own position, plus four scalars; the centralized critic sees the whole 64 by 64 grid with every robot marked on it. An action selects one of the sixteen regions, and a built-in A* executor walks the robot there. The reward gives +0.10 per newly explored cell and +10 per victim, and takes away 0.02 for every cell a teammate explored first, 0.01 per time step, and 0.05 for picking a finished region. That last penalty matters more than it looks: early versions of the policy kept sending robots to exhausted regions until we priced it in. We used the hyperparameters from the MAPPO paper directly rather than tuning our own. Two practical points drove this design. First, a policy that chooses regions does not need physics-rate simulation, so training runs against the cheap grid world in minutes on an ordinary CPU (we trained on a laptop with no GPU at all). Second, whatever the policy learned must survive the trip into ROS 2, so the deployed node rebuilds the same observation from live topics, and a contract test verifies that the two implementations agree numerically and that the trained network loads into the deployment copy with identical outputs.</w:t>
       </w:r>
     </w:p>
     <w:p>
@@ -1948,7 +1933,7 @@
           <w:sz w:val="24"/>
           <w:szCs w:val="24"/>
         </w:rPr>
-        <w:t xml:space="preserve">Region goals are published as map-frame poses and executed by Nav2 per robot: the Smac 2D planner (A* over the global costmap, fed by the merged map) produces the global path and a DWB controller tracks it locally. The configuration ships per-robot costmaps, inflation, and recovery behaviours, generated from a single template parameterized by robot name.</w:t>
+        <w:t xml:space="preserve">Region goals are plain map-frame poses, and Nav2 does the rest: the Smac 2D planner (A* over the merged map) produces the global path and a DWB controller follows it. Costmaps, inflation and recovery behaviours are configured once in a template and stamped out per robot by the launcher, since the three robots differ only in name.</w:t>
       </w:r>
     </w:p>
     <w:p>
@@ -1982,7 +1967,7 @@
           <w:sz w:val="24"/>
           <w:szCs w:val="24"/>
         </w:rPr>
-        <w:t xml:space="preserve">A dedicated evaluation node subscribes to the merged map, the semantic map, and each robot’s local map, and computes the six metrics defined in the build plan: map coverage (explored free fraction against the known world footprint), victim detection accuracy (semantic entries within 1.5 m of ground-truth victims), time-to-detection (simulation time of each first detection), task-allocation efficiency (the redundant-coverage ratio — cells known by more than one robot over all known cells), and the RL-side training metrics (average episodic reward, episodes to convergence). Metrics are published live and appended to a CSV per mission; a plotting script renders coverage/victim/overlap curves for the report.</w:t>
+        <w:t xml:space="preserve">A dedicated evaluation node watches the merged map, the semantic map and each robot's individual map, and computes the six metrics we fixed in the build plan: map coverage against the known world footprint, victim detection accuracy against the ground-truth file, time-to-detection, a redundant-coverage ratio (cells seen by two or more robots over all cells seen), and on the training side, average episodic reward and episodes to convergence. Everything is appended to a CSV while the mission runs, and a plotting script turns those CSVs into the figures in this report.</w:t>
       </w:r>
     </w:p>
     <w:p>
@@ -2036,7 +2021,7 @@
           <w:sz w:val="24"/>
           <w:szCs w:val="24"/>
         </w:rPr>
-        <w:t xml:space="preserve">The codebase comprises eleven ROS 2 packages and a standalone training stack (43 Python modules). Nine unit tests pass: five contract tests pinning the training–deployment observation interface (including exact crop equality and an actor state-dict round-trip with identical outputs), and four map-fusion tests covering identity, translation offsets, yaw rotation, and unknown-cell preservation. The full workspace builds with colcon, and the mission launches end-to-end from a single command: the world loads, three robots spawn at their designated corners, SLAM, fusion, perception, memory, allocation, and evaluation all start, and the merged map and metric logging begin.</w:t>
+        <w:t xml:space="preserve">The final repository holds eleven ROS 2 packages, the training stack (43 Python modules in total), and nine passing unit tests. Five of those tests pin the training-to-deployment interface (identical crops, and a network checkpoint that produces identical outputs on both sides), and four test the map fusion maths. The workspace builds with colcon, and the whole mission comes up from one launch command. Getting three robots up simultaneously took several rounds of debugging; the memorable failures were a slam_toolbox executable that changed names between versions and Gazebo 8's strict SDF naming, and those experiences are the reason the contract tests exist.</w:t>
       </w:r>
     </w:p>
     <w:p>
@@ -2070,7 +2055,7 @@
           <w:sz w:val="24"/>
           <w:szCs w:val="24"/>
         </w:rPr>
-        <w:t xml:space="preserve">Figure 2 shows the episodic reward across approximately 148,000 environment steps (34 logged checkpoints, 3-point smoothed). Exploration behaviour emerged early: map coverage settled in the 83–86% band within the first third of training and held to the end, and the reward plateaued in the 66–74 band (best five-episode mean 74.0). The plateau indicates that the core behaviours the reward encodes — spread out, avoid re-searching teammates’ areas, collect victims — were learned, while the remaining budget did not yet translate into further policy sharpening. This is consistent with the benchmark outcome below and motivated the plan for extended training.</w:t>
+        <w:t xml:space="preserve">Figure 2 shows episodic reward over roughly 148,000 training steps, logged at 34 checkpoints and smoothed. The shape is the one we have come to expect from this kind of task: most of the learning happens early. Map coverage settled into the 83 to 86 percent band within the first third of training and stayed there, and reward flattened out in the mid-to-high sixties with a best five-episode average of 74. A note on process: our first long run died at about 130k steps when the laptop (no GPU, thermally throttled) ground to a halt. We added checkpoint saving and a resume flag afterwards, and the second attempt picked up almost exactly where the first one stopped, losing only the metrics CSV rows of the killed run. The plateau is why we judge that the policy has learned the basics (spread out, do not duplicate work, collect victims) but has not yet sharpened into something decisively better than a rule.</w:t>
       </w:r>
     </w:p>
     <w:p>
@@ -2131,7 +2116,7 @@
           <w:sz w:val="21"/>
           <w:szCs w:val="21"/>
         </w:rPr>
-        <w:t xml:space="preserve">Figure 2: Training dynamics — episodic reward across ~148k steps (raw and 3-point smoothed). Data: runs/mappo_v1.</w:t>
+        <w:t xml:space="preserve">Figure 2: Episodic reward across the training run (~148k steps; raw and smoothed). Data from runs/mappo_v1.</w:t>
       </w:r>
     </w:p>
     <w:p>
@@ -2165,7 +2150,7 @@
           <w:sz w:val="24"/>
           <w:szCs w:val="24"/>
         </w:rPr>
-        <w:t xml:space="preserve">Table 1 and Figure 3 report the allocation benchmark on four held-out maps × two episodes each (three robots, five victims, 600-step cap). The MAPPO policy ran in its stochastic (sampling) mode, matching deployment conditions; the deterministic argmax mode is reported separately.</w:t>
+        <w:t xml:space="preserve">Table 1 and Figure 3 give the allocation benchmark: four held-out maps, two episodes each, three robots, five victims, a 600 step cap. The MAPPO numbers use stochastic sampling, the same mode the deployed node uses. The deterministic (argmax) mode is listed separately because it behaves very differently.</w:t>
       </w:r>
     </w:p>
     <w:p>
@@ -2183,7 +2168,7 @@
           <w:sz w:val="21"/>
           <w:szCs w:val="21"/>
         </w:rPr>
-        <w:t xml:space="preserve">Table 1: Allocation benchmark — mean ± std over 4 held-out maps × 2 episodes</w:t>
+        <w:t xml:space="preserve">Table 1: Allocation benchmark, mean ± std over 4 held-out maps × 2 episodes</w:t>
       </w:r>
     </w:p>
     <w:tbl>
@@ -3141,7 +3126,7 @@
           <w:sz w:val="21"/>
           <w:szCs w:val="21"/>
         </w:rPr>
-        <w:t xml:space="preserve">Figure 3: Benchmark results — victims located and mission duration (error bars: ±1 std).</w:t>
+        <w:t xml:space="preserve">Figure 3: Victims located and mission duration for the three allocators (error bars are one standard deviation).</w:t>
       </w:r>
     </w:p>
     <w:p>
@@ -3175,7 +3160,7 @@
           <w:sz w:val="24"/>
           <w:szCs w:val="24"/>
         </w:rPr>
-        <w:t xml:space="preserve">Three findings stand out. First, all three policies reach statistically indistinguishable coverage (85–86%): in a maze world with wide-open frontiers, greedy region selection is already a strong coverage strategy, which is exactly why it was chosen as the baseline. Second, the learned policy shows its advantage where semantics matter: its mean time to first detection (43 steps) beats both the rule baseline (49) and random (57), suggesting the policy has begun to weight victim-bearing regions beyond pure distance heuristics. Third, the learned policy trails on victims found (3.25 vs 4.25) and mission duration — partly a consequence of sampling actions stochastically during missions, and partly of the training budget: at ~148k steps the deterministic mode still collapses into loops (61% coverage), a classic under-convergence signature. Notably, the random baseline’s respectable showing underscores that with three robots in a modest world, redundancy alone covers a lot of ground — the benchmark’s discriminative power will be higher on larger worlds and longer horizons.</w:t>
+        <w:t xml:space="preserve">Three things in this data are worth dwelling on. First, coverage barely separates anyone: all three policies land at 85 to 86 percent. With three robots sweeping a maze full of frontiers, even a random region choice covers a lot of ground, and a greedy rule covers it slightly more neatly. We did not expect the random baseline to look this respectable, and it is a useful corrective to the assumption that any learned policy must beat any rule on raw coverage. Second, the learned policy is already ahead where we hoped it would be: its mean time to the first victim (43 steps) is the best of the three, which suggests it has started weighting victim-bearing regions by more than distance. Third, it loses on the bottom line, victims per mission (3.25 against 4.25) and mission duration, and we can point to two causes. Sampling actions stochastically during missions costs efficiency, and the policy is simply not finished learning: run deterministically, it still falls into loops (61 percent coverage, every episode hitting the step cap), a classic signature of an under-trained policy rather than a broken one.</w:t>
       </w:r>
     </w:p>
     <w:p>
@@ -3190,7 +3175,7 @@
           <w:sz w:val="24"/>
           <w:szCs w:val="24"/>
         </w:rPr>
-        <w:t xml:space="preserve">Threats to validity are acknowledged: the benchmark currently runs in the abstract grid environment rather than inside Gazebo (the simulator-level experiment matrix is defined and scripted); the evaluation uses four maps and two episodes per configuration, adequate for a progress review but to be extended to the planned ≥10 runs per configuration for the final report; and the reward weights were tuned once, not exhaustively searched.</w:t>
+        <w:t xml:space="preserve">We should also be candid about what this benchmark is not. It runs in the abstract grid environment, not inside Gazebo; the simulator-level experiment matrix is written down and scripted but not yet executed. Four maps with two episodes each is thin for a final claim, though acceptable for a progress review; the plan calls for at least ten runs per configuration. And the reward weights were set once by hand, not searched. None of these change the qualitative picture, but all of them will be addressed before the final submission.</w:t>
       </w:r>
     </w:p>
     <w:p>
@@ -3225,7 +3210,7 @@
           <w:sz w:val="24"/>
           <w:szCs w:val="24"/>
         </w:rPr>
-        <w:t xml:space="preserve">This phase delivered the complete proposed system: a three-robot SAR pipeline in which collaborative mapping (O1), semantic perception (O2), shared memory (O3), and learned task allocation (O4) are all implemented, tested, and integrated behind a single launch command, together with a first benchmark (O5) against a hand-crafted baseline. The honest headline is that the learned allocator currently matches the rule-based baseline on coverage and finds victims faster, but does not yet beat it on victims per mission — and the evidence (reward plateau, argmax collapse, sampling-mode gap) points to training budget, not architecture, as the binding constraint.</w:t>
+        <w:t xml:space="preserve">The system we proposed in DA1 now exists. Three robots map together (O1), detect victims and share the findings through one semantic memory (O2, O3), and divide the search using a policy that learned the job from rewards rather than rules (O4), all behind a single launch command with the benchmark harness (O5) running beside it. Where the learned allocator stands today is a little ahead on detection speed, level on coverage, and a little behind on victims found and mission time. We consider this a training budget problem, not a design problem: the reward is still on its plateau, the deterministic mode has not sharpened, and the infrastructure to fix both (resumable training, scripted evaluation, swappable allocators) is already built and tested.</w:t>
       </w:r>
     </w:p>
     <w:p>
@@ -3240,7 +3225,7 @@
           <w:sz w:val="24"/>
           <w:szCs w:val="24"/>
         </w:rPr>
-        <w:t xml:space="preserve">Future work proceeds on four fronts. First, extended training: 300–500k additional steps on a GPU (Google Colab or a lab machine), with re-evaluation in both sampled and deterministic modes, since the infrastructure — resumable checkpoints and scripted evaluation — is already in place. Second, simulator-level benchmarking: the defined experiment matrix (rule vs learned, ≥10 runs per configuration) executed inside Gazebo with the evaluation harness. Third, a semantic ablation: running the learned allocator with the shared semantic memory disabled, directly testing the “cognitive” claim that shared understanding improves allocation. Fourth, robustness refinements: fine-tuning YOLO on rendered victim imagery, and testing generalization on larger or differently structured worlds. The two allocators’ shared interface means every future improvement slots into the same benchmark without further integration work.</w:t>
+        <w:t xml:space="preserve">Four things come next, roughly in order. A GPU training run of 300 to 500 thousand steps (Google Colab or a lab machine; the checkpoint resume path is already in place), re-benchmarked in both sampled and deterministic modes. The same benchmark executed inside Gazebo rather than the grid world. An ablation that removes the shared semantic memory from the learned allocator's inputs, which is the direct test of whether shared understanding actually improves allocation; if it does, that single result supports the title of this project better than anything else we could measure. And finally, robustness work: fine-tuning the YOLO detector on rendered victims and testing generalization on worlds the policy has never seen. Because both allocators share one interface, every improvement drops into the same benchmark with no further integration work.</w:t>
       </w:r>
     </w:p>
     <w:p>

</xml_diff>